<commit_message>
Syllabus (7): seccion de virtudes reescrita con el porque (lo que vendemos, el ingles no se aprende sin ellas, retencion), las cuatro con su traduccion al aula, el ritual VATS paso a paso con ejemplo, lo que NO es, y la respuesta al estudiante
Co-Authored-By: Claude Fable 5.1 <noreply@anthropic.com>
</commit_message>
<xml_diff>
--- a/VERSION_2/A1_2H/SYLLABUS_A1_NOCTURNO_2H.docx
+++ b/VERSION_2/A1_2H/SYLLABUS_A1_NOCTURNO_2H.docx
@@ -696,7 +696,252 @@
           <w:color w:val="E54C09"/>
           <w:sz w:val="23"/>
         </w:rPr>
-        <w:t>6. LAS VIRTUDES: LO QUE HACE QUE ESTO SEA HEIIU Y NO UN CURSO DE INGLÉS</w:t>
+        <w:t>6. LAS VIRTUDES: POR QUÉ LAS HACEMOS Y CÓMO SE HACEN BIEN</w:t>
+      </w:r>
+    </w:p>
+    <w:p>
+      <w:pPr>
+        <w:spacing w:after="60"/>
+      </w:pPr>
+      <w:r>
+        <w:rPr>
+          <w:b/>
+          <w:sz w:val="20"/>
+        </w:rPr>
+        <w:t>Por qué, en tres frases que puedes repetir:</w:t>
+      </w:r>
+    </w:p>
+    <w:p>
+      <w:pPr>
+        <w:spacing w:after="40"/>
+        <w:ind w:left="283"/>
+      </w:pPr>
+      <w:r>
+        <w:rPr>
+          <w:b/>
+          <w:sz w:val="20"/>
+        </w:rPr>
+        <w:t xml:space="preserve">• Porque es lo que vendemos. </w:t>
+      </w:r>
+      <w:r>
+        <w:rPr>
+          <w:sz w:val="20"/>
+        </w:rPr>
+        <w:t>Al estudiante no se le prometió inglés: se le prometió entrenamiento con garantía y un destino (un trabajo, irse, emprender). Lo que decide si llega a ese destino no es la gramática: es si aparece a tiempo, si sostiene el esfuerzo cuando ya no es novedad, si se atreve a hablar con miedo, si cumple lo que dijo. Eso es lo que un jefe, una familia de Au Pair o un cliente evalúan primero. Las virtudes son ese entrenamiento, con nombre.</w:t>
+      </w:r>
+    </w:p>
+    <w:p>
+      <w:pPr>
+        <w:spacing w:after="40"/>
+        <w:ind w:left="283"/>
+      </w:pPr>
+      <w:r>
+        <w:rPr>
+          <w:b/>
+          <w:sz w:val="20"/>
+        </w:rPr>
+        <w:t xml:space="preserve">• Porque el inglés no se aprende sin ellas. </w:t>
+      </w:r>
+      <w:r>
+        <w:rPr>
+          <w:sz w:val="20"/>
+        </w:rPr>
+        <w:t>Repetir mil veces lo mismo es templanza. Hablar frente a otros sabiendo que te vas a equivocar es fortaleza. Grabar el video el día que no quieres es prudencia y templanza juntas. Un estudiante que entiende que la virtud del bloque es lo que le va a permitir sostener el nivel, deja de ver el ritual como relleno.</w:t>
+      </w:r>
+    </w:p>
+    <w:p>
+      <w:pPr>
+        <w:spacing w:after="40"/>
+        <w:ind w:left="283"/>
+      </w:pPr>
+      <w:r>
+        <w:rPr>
+          <w:b/>
+          <w:sz w:val="20"/>
+        </w:rPr>
+        <w:t xml:space="preserve">• Porque es lo que hace que se queden. </w:t>
+      </w:r>
+      <w:r>
+        <w:rPr>
+          <w:sz w:val="20"/>
+        </w:rPr>
+        <w:t>El que abandona en la semana 3 no abandona por la gramática: abandona porque no tenía nombre para lo que le estaba pasando. Cuando el docente le dice "esto que sientes es la parte de fortaleza del nivel, y por eso la estamos entrenando", el estudiante se queda. La retención del grupo depende de esto más que de cualquier otra cosa que hagas.</w:t>
+      </w:r>
+    </w:p>
+    <w:p>
+      <w:pPr>
+        <w:spacing w:after="60"/>
+      </w:pPr>
+      <w:r>
+        <w:rPr>
+          <w:b/>
+          <w:sz w:val="20"/>
+        </w:rPr>
+        <w:t>Las cuatro, por calendario absoluto (bloques de 5 clases; Cl 1-5 Prudencia; la guía del día dice cuál sigue, y no se desplaza por festivos):</w:t>
+      </w:r>
+    </w:p>
+    <w:p>
+      <w:pPr>
+        <w:spacing w:after="40"/>
+        <w:ind w:left="283"/>
+      </w:pPr>
+      <w:r>
+        <w:rPr>
+          <w:b/>
+          <w:sz w:val="20"/>
+        </w:rPr>
+        <w:t xml:space="preserve">• PRUDENCIA: </w:t>
+      </w:r>
+      <w:r>
+        <w:rPr>
+          <w:sz w:val="20"/>
+        </w:rPr>
+        <w:t>pensar antes de actuar, planear, decidir. En inglés: preparar lo que vas a decir antes de decirlo; elegir el tiempo verbal antes de abrir la boca.</w:t>
+      </w:r>
+    </w:p>
+    <w:p>
+      <w:pPr>
+        <w:spacing w:after="40"/>
+        <w:ind w:left="283"/>
+      </w:pPr>
+      <w:r>
+        <w:rPr>
+          <w:b/>
+          <w:sz w:val="20"/>
+        </w:rPr>
+        <w:t xml:space="preserve">• FORTALEZA: </w:t>
+      </w:r>
+      <w:r>
+        <w:rPr>
+          <w:sz w:val="20"/>
+        </w:rPr>
+        <w:t>coraje para hablar con miedo, iniciativa, no rendirse. En inglés: pedir la palabra, ser el guest en la simulación, grabar el video aunque salga mal.</w:t>
+      </w:r>
+    </w:p>
+    <w:p>
+      <w:pPr>
+        <w:spacing w:after="40"/>
+        <w:ind w:left="283"/>
+      </w:pPr>
+      <w:r>
+        <w:rPr>
+          <w:b/>
+          <w:sz w:val="20"/>
+        </w:rPr>
+        <w:t xml:space="preserve">• TEMPLANZA: </w:t>
+      </w:r>
+      <w:r>
+        <w:rPr>
+          <w:sz w:val="20"/>
+        </w:rPr>
+        <w:t>disciplina, manejo del tiempo, paciencia con la repetición. En inglés: el video diario, llegar a tiempo, hacer el drill completo sin atajos.</w:t>
+      </w:r>
+    </w:p>
+    <w:p>
+      <w:pPr>
+        <w:spacing w:after="40"/>
+        <w:ind w:left="283"/>
+      </w:pPr>
+      <w:r>
+        <w:rPr>
+          <w:b/>
+          <w:sz w:val="20"/>
+        </w:rPr>
+        <w:t xml:space="preserve">• JUSTICIA: </w:t>
+      </w:r>
+      <w:r>
+        <w:rPr>
+          <w:sz w:val="20"/>
+        </w:rPr>
+        <w:t>trabajo en equipo, liderazgo ético, empatía. En inglés: escuchar al compañero en la simulación, corregir sin humillar, ayudar al que va más lento.</w:t>
+      </w:r>
+    </w:p>
+    <w:p>
+      <w:pPr>
+        <w:spacing w:after="60"/>
+      </w:pPr>
+      <w:r>
+        <w:rPr>
+          <w:b/>
+          <w:sz w:val="20"/>
+        </w:rPr>
+        <w:t>Cómo se hace bien, en 5 a 7 minutos (el ritual VATS, al inicio de la clase):</w:t>
+      </w:r>
+    </w:p>
+    <w:p>
+      <w:pPr>
+        <w:spacing w:after="40"/>
+        <w:ind w:left="283"/>
+      </w:pPr>
+      <w:r>
+        <w:rPr>
+          <w:b/>
+          <w:sz w:val="20"/>
+        </w:rPr>
+        <w:t xml:space="preserve">• V, Virtud (1 min): </w:t>
+      </w:r>
+      <w:r>
+        <w:rPr>
+          <w:sz w:val="20"/>
+        </w:rPr>
+        <w:t>el docente nombra la virtud del bloque y la conecta con lo de HOY en una frase: "Esta semana es fortaleza. Hoy la simulación es una entrevista: la fortaleza es contestar aunque no tengas la palabra perfecta."</w:t>
+      </w:r>
+    </w:p>
+    <w:p>
+      <w:pPr>
+        <w:spacing w:after="40"/>
+        <w:ind w:left="283"/>
+      </w:pPr>
+      <w:r>
+        <w:rPr>
+          <w:b/>
+          <w:sz w:val="20"/>
+        </w:rPr>
+        <w:t xml:space="preserve">• A, Activar (2 min): </w:t>
+      </w:r>
+      <w:r>
+        <w:rPr>
+          <w:sz w:val="20"/>
+        </w:rPr>
+        <w:t>una pregunta, en inglés, que junte la virtud con la gramática del día. Ejemplo con presente perfecto: "What is something you have done this year that took courage?" Cada uno piensa 30 segundos.</w:t>
+      </w:r>
+    </w:p>
+    <w:p>
+      <w:pPr>
+        <w:spacing w:after="40"/>
+        <w:ind w:left="283"/>
+      </w:pPr>
+      <w:r>
+        <w:rPr>
+          <w:b/>
+          <w:sz w:val="20"/>
+        </w:rPr>
+        <w:t xml:space="preserve">• T, Hablar (2-3 min): </w:t>
+      </w:r>
+      <w:r>
+        <w:rPr>
+          <w:sz w:val="20"/>
+        </w:rPr>
+        <w:t>en parejas o en cadena de pie, cada uno responde en una o dos frases. El docente escucha y anota errores para el error paper, no corrige aquí.</w:t>
+      </w:r>
+    </w:p>
+    <w:p>
+      <w:pPr>
+        <w:spacing w:after="40"/>
+        <w:ind w:left="283"/>
+      </w:pPr>
+      <w:r>
+        <w:rPr>
+          <w:b/>
+          <w:sz w:val="20"/>
+        </w:rPr>
+        <w:t xml:space="preserve">• S, Compartir (1 min): </w:t>
+      </w:r>
+      <w:r>
+        <w:rPr>
+          <w:sz w:val="20"/>
+        </w:rPr>
+        <w:t>dos o tres respuestas al grupo. El docente cierra con una sola frase que conecta: "That is why today you speak first and think second."</w:t>
       </w:r>
     </w:p>
     <w:p>
@@ -708,7 +953,31 @@
           <w:b w:val="0"/>
           <w:sz w:val="20"/>
         </w:rPr>
-        <w:t>Cada bloque de 5 clases trabaja una de las cuatro virtudes cardinales, por calendario absoluto (Cl 1-5 Prudencia; la virtud no se desplaza por festivos ni por clases canceladas, y la guia del dia dice cual sigue): PRUDENCIA (pensar antes de actuar, planear, decidir), FORTALEZA (coraje para hablar, iniciativa, no rendirse), TEMPLANZA (disciplina, manejo del tiempo, paciencia) y JUSTICIA (trabajo en equipo, liderazgo etico, empatia). La virtud no es un adorno: es el hilo del que cuelga la clase. La Frase del Dia la lleva dentro, el ritual VATS de 5 a 7 minutos al inicio la activa (Virtud, Activar, Hablar, Compartir: una pregunta que junta la virtud con la estructura del dia), y la simulacion la pone a prueba. Por eso vendemos "ingles y caracter": puntualidad, constancia, decir la verdad, terminar lo que se empieza. Un estudiante que sale de aqui hablando ingles pero sin haber entrenado eso, no recibio el programa completo. El docente la nombra, la usa y la exige todos los dias, sin sermon: en una frase y en lo que pide.</w:t>
+        <w:t>Lo que NO es: no es un sermón, no es una charla de motivación, no dura 15 minutos y no se salta cuando "no hay tiempo". Es una frase, una pregunta y las voces de ellos. Si el docente lo recorta, la clase pierde su hilo y el estudiante pierde la razón para volver mañana.</w:t>
+      </w:r>
+    </w:p>
+    <w:p>
+      <w:pPr>
+        <w:spacing w:after="60"/>
+      </w:pPr>
+      <w:r>
+        <w:rPr>
+          <w:b/>
+          <w:sz w:val="20"/>
+        </w:rPr>
+        <w:t>Cuando un estudiante pregunte "¿y esto qué tiene que ver con inglés?", la respuesta es esta:</w:t>
+      </w:r>
+    </w:p>
+    <w:p>
+      <w:pPr>
+        <w:spacing w:after="60"/>
+      </w:pPr>
+      <w:r>
+        <w:rPr>
+          <w:b w:val="0"/>
+          <w:sz w:val="20"/>
+        </w:rPr>
+        <w:t>"Todo. Aquí no te estamos enseñando palabras: te estamos entrenando para el día que las necesites de verdad, en una entrevista, en un vuelo, frente a un cliente. Ese día no te va a fallar el vocabulario: te va a fallar el nervio, o la constancia, o la preparación. Eso es lo que entrenamos con las virtudes. Y es lo que hace que el que se gradúa aquí no solo hable inglés: se le nota."</w:t>
       </w:r>
     </w:p>
     <w:p>

</xml_diff>

<commit_message>
Syllabus (7): seccion 'Los rituales y por que existen' — Frase del Dia, chequeo de portafolio, recuperacion N-3/N-7, bloques largos, guest-observer, error paper, ticket de salida, tarea con hora, cero impreso, sin nombres; cada uno con su porque
Co-Authored-By: Claude Fable 5.1 <noreply@anthropic.com>
</commit_message>
<xml_diff>
--- a/VERSION_2/A1_2H/SYLLABUS_A1_NOCTURNO_2H.docx
+++ b/VERSION_2/A1_2H/SYLLABUS_A1_NOCTURNO_2H.docx
@@ -990,7 +990,7 @@
           <w:color w:val="E54C09"/>
           <w:sz w:val="23"/>
         </w:rPr>
-        <w:t>7. LO QUE NO CAMBIA</w:t>
+        <w:t>7. LOS RITUALES Y POR QUÉ EXISTEN (lo que no cambia)</w:t>
       </w:r>
     </w:p>
     <w:p>
@@ -1002,7 +1002,197 @@
           <w:b w:val="0"/>
           <w:sz w:val="20"/>
         </w:rPr>
-        <w:t>Frase del Día en el tablero antes de empezar: cada clase estrena la suya, se usa 3 o más veces natural y al cierre un estudiante la dice y otro la usa en una oración nueva. Feedback diario del docente; notas y resultados solo por coordinación. Cuatro bloques largos, nunca doce actividades sueltas. Cero material impreso preparado: todo en tablero o dictado, con Plan B en cada bloque. Simulación realista — cotidiana o profesional, nunca fantasiosa — con un guest, observadores con tarea concreta y el docente como coach: el docente NUNCA juega guest. Ticket de salida en los últimos 5 minutos, se recogen todos y no se evalúan. Tarea con hora de entrega: siempre antes de las 6:30 PM del día siguiente, no fragmentada, y no se acepta "no me dio tiempo". Sin nombres de estudiantes en la guia; sin nombres de metodologías frente a los estudiantes.</w:t>
+        <w:t>Ninguno de estos es un capricho ni una formalidad. Cada uno resuelve un problema concreto que ya nos costó estudiantes. El docente que entiende para qué sirve cada uno, lo hace bien; el que lo ve como regla, lo recorta.</w:t>
+      </w:r>
+    </w:p>
+    <w:p>
+      <w:pPr>
+        <w:spacing w:after="40"/>
+        <w:ind w:left="283"/>
+      </w:pPr>
+      <w:r>
+        <w:rPr>
+          <w:b/>
+          <w:sz w:val="20"/>
+        </w:rPr>
+        <w:t xml:space="preserve">• La Frase del Día en el tablero, antes de que entren. </w:t>
+      </w:r>
+      <w:r>
+        <w:rPr>
+          <w:sz w:val="20"/>
+        </w:rPr>
+        <w:t>Es UNA frase que lleva dentro la gramática del día y la virtud de la semana. Se lee, se repite en coro, se usa tres veces en la clase y al cierre alguien la dice de memoria. Por qué: una frase que se oye, se dice y se usa diez veces en contexto se queda; una lista de veinte palabras copiadas no. Es la forma más barata de repetición espaciada que existe, y es el ancla visible de toda la clase: el estudiante distraído levanta la vista y sabe de qué se trata hoy. Reemplazó a las listas de vocabulario en cuaderno, que nadie volvía a abrir. Cada clase estrena la suya; la de ayer va en el reporte solo como referencia.</w:t>
+      </w:r>
+    </w:p>
+    <w:p>
+      <w:pPr>
+        <w:spacing w:after="40"/>
+        <w:ind w:left="283"/>
+      </w:pPr>
+      <w:r>
+        <w:rPr>
+          <w:b/>
+          <w:sz w:val="20"/>
+        </w:rPr>
+        <w:t xml:space="preserve">• El chequeo de portafolio, al abrir. </w:t>
+      </w:r>
+      <w:r>
+        <w:rPr>
+          <w:sz w:val="20"/>
+        </w:rPr>
+        <w:t>Quién envió el video y una mejora dicha en voz alta a cada uno. Por qué: es el único momento del día en que cada estudiante recibe feedback personal, y es lo que hace que el video se grabe mañana también. Un portafolio que nadie ve muere en dos semanas.</w:t>
+      </w:r>
+    </w:p>
+    <w:p>
+      <w:pPr>
+        <w:spacing w:after="40"/>
+        <w:ind w:left="283"/>
+      </w:pPr>
+      <w:r>
+        <w:rPr>
+          <w:b/>
+          <w:sz w:val="20"/>
+        </w:rPr>
+        <w:t xml:space="preserve">• La recuperación al abrir (lo de hace 3 y hace 7 clases). </w:t>
+      </w:r>
+      <w:r>
+        <w:rPr>
+          <w:sz w:val="20"/>
+        </w:rPr>
+        <w:t>Dos o tres preguntas de pie sobre lo que se vio hace tres y siete clases, antes de lo nuevo. Por qué: lo que se recupera justo cuando se está olvidando se fija para siempre; lo que se vio una sola vez se pierde en diez días. Son tres minutos que valen una clase de repaso.</w:t>
+      </w:r>
+    </w:p>
+    <w:p>
+      <w:pPr>
+        <w:spacing w:after="40"/>
+        <w:ind w:left="283"/>
+      </w:pPr>
+      <w:r>
+        <w:rPr>
+          <w:b/>
+          <w:sz w:val="20"/>
+        </w:rPr>
+        <w:t xml:space="preserve">• Cuatro bloques largos, no doce cortos. </w:t>
+      </w:r>
+      <w:r>
+        <w:rPr>
+          <w:sz w:val="20"/>
+        </w:rPr>
+        <w:t>Por qué: hablar un idioma exige tiempo sostenido en una misma situación; con actividades de ocho minutos el estudiante nunca llega a la parte difícil, que es donde se aprende.</w:t>
+      </w:r>
+    </w:p>
+    <w:p>
+      <w:pPr>
+        <w:spacing w:after="40"/>
+        <w:ind w:left="283"/>
+      </w:pPr>
+      <w:r>
+        <w:rPr>
+          <w:b/>
+          <w:sz w:val="20"/>
+        </w:rPr>
+        <w:t xml:space="preserve">• La simulación con un guest, observadores con tarea y el docente como coach (nunca como guest). </w:t>
+      </w:r>
+      <w:r>
+        <w:rPr>
+          <w:sz w:val="20"/>
+        </w:rPr>
+        <w:t>Por qué: el estudiante que hace de guest vive la situación real (una entrevista, una queja, una negociación) y los que observan trabajan con una ficha, así nadie mira el techo. Si el docente hace de guest, la simulación se vuelve una conversación con el profesor, que es justo lo que el estudiante ya sabe hacer.</w:t>
+      </w:r>
+    </w:p>
+    <w:p>
+      <w:pPr>
+        <w:spacing w:after="40"/>
+        <w:ind w:left="283"/>
+      </w:pPr>
+      <w:r>
+        <w:rPr>
+          <w:b/>
+          <w:sz w:val="20"/>
+        </w:rPr>
+        <w:t xml:space="preserve">• El error paper: anónimo en el tablero, con nombres solo para coordinación. </w:t>
+      </w:r>
+      <w:r>
+        <w:rPr>
+          <w:sz w:val="20"/>
+        </w:rPr>
+        <w:t>Por qué: el error sin nombre se corrige entre todos y nadie se avergüenza, así que la próxima vez se atreven a hablar igual; el registro con nombres le permite a coordinación ver quién repite qué y actuar antes de que se vuelva un retiro.</w:t>
+      </w:r>
+    </w:p>
+    <w:p>
+      <w:pPr>
+        <w:spacing w:after="40"/>
+        <w:ind w:left="283"/>
+      </w:pPr>
+      <w:r>
+        <w:rPr>
+          <w:b/>
+          <w:sz w:val="20"/>
+        </w:rPr>
+        <w:t xml:space="preserve">• El ticket de salida, en los últimos 5 minutos. </w:t>
+      </w:r>
+      <w:r>
+        <w:rPr>
+          <w:sz w:val="20"/>
+        </w:rPr>
+        <w:t>Tres a cinco frases escritas por cada estudiante con la estructura de hoy, con nombre, sin calificar. Por qué: es la evidencia diaria de que cada uno aprendió lo de ese día, sin depender de la opinión de nadie. Es lo que sostiene la garantía y lo que le muestra a coordinación quién va y quién no. Se recogen todos: un ticket que falta es una señal.</w:t>
+      </w:r>
+    </w:p>
+    <w:p>
+      <w:pPr>
+        <w:spacing w:after="40"/>
+        <w:ind w:left="283"/>
+      </w:pPr>
+      <w:r>
+        <w:rPr>
+          <w:b/>
+          <w:sz w:val="20"/>
+        </w:rPr>
+        <w:t xml:space="preserve">• La tarea con hora de entrega, sin excepciones. </w:t>
+      </w:r>
+      <w:r>
+        <w:rPr>
+          <w:sz w:val="20"/>
+        </w:rPr>
+        <w:t>Por qué: la constancia no se enseña con discursos, se entrena con fechas que se cumplen. Y la hora fija (antes de la clase siguiente) evita el "te lo mando después", que es el principio del abandono.</w:t>
+      </w:r>
+    </w:p>
+    <w:p>
+      <w:pPr>
+        <w:spacing w:after="40"/>
+        <w:ind w:left="283"/>
+      </w:pPr>
+      <w:r>
+        <w:rPr>
+          <w:b/>
+          <w:sz w:val="20"/>
+        </w:rPr>
+        <w:t xml:space="preserve">• Cero material impreso: todo en el tablero, en el papel del estudiante o dictado. </w:t>
+      </w:r>
+      <w:r>
+        <w:rPr>
+          <w:sz w:val="20"/>
+        </w:rPr>
+        <w:t>Por qué: sin hoja, la atención está en el docente y en hablar; con hoja, el estudiante lee en vez de escuchar. Y el material de Heiiu es propiedad intelectual de la academia: la guía es solo para el docente y no se fotografía ni se comparte.</w:t>
+      </w:r>
+    </w:p>
+    <w:p>
+      <w:pPr>
+        <w:spacing w:after="40"/>
+        <w:ind w:left="283"/>
+      </w:pPr>
+      <w:r>
+        <w:rPr>
+          <w:b/>
+          <w:sz w:val="20"/>
+        </w:rPr>
+        <w:t xml:space="preserve">• Sin nombres de estudiantes en las guías, sin nombres de metodologías frente a ellos, sin notas de boca del docente. </w:t>
+      </w:r>
+      <w:r>
+        <w:rPr>
+          <w:sz w:val="20"/>
+        </w:rPr>
+        <w:t>Por qué: la guía es reutilizable y no lleva casos personales; los nombres de las técnicas son de la academia y no se enseñan; y las notas van por coordinación para que ningún estudiante negocie su resultado con su profesor.</w:t>
       </w:r>
     </w:p>
     <w:p>

</xml_diff>

<commit_message>
Grabacion de entrada: regla fija (quien falte en Cl 1 o entre despues se graba en su primera clase) en A1 2H Cl 1 y en los 7 syllabus
Co-Authored-By: Claude Fable 5.1 <noreply@anthropic.com>
</commit_message>
<xml_diff>
--- a/VERSION_2/A1_2H/SYLLABUS_A1_NOCTURNO_2H.docx
+++ b/VERSION_2/A1_2H/SYLLABUS_A1_NOCTURNO_2H.docx
@@ -411,13 +411,13 @@
           <w:b/>
           <w:sz w:val="20"/>
         </w:rPr>
-        <w:t xml:space="preserve">• Grabación oral de entrada (solo Clase 1): </w:t>
+        <w:t xml:space="preserve">• Grabación oral de entrada (Clase 1, o la primera clase a la que asista cada estudiante): </w:t>
       </w:r>
       <w:r>
         <w:rPr>
           <w:sz w:val="20"/>
         </w:rPr>
-        <w:t>el docente graba a cada estudiante 1 a 2 minutos hablando, mientras el resto trabaja. Es la foto de partida del nivel para la garantía. Esa misma noche se las envía a la auxiliar administrativa por WhatsApp, una por una con el nombre, y ella las guarda en el computador de la academia.</w:t>
+        <w:t>el docente graba a cada estudiante 1 a 2 minutos hablando, mientras el resto trabaja. Es la foto de partida del nivel para la garantía. Esa misma noche se las envía a la auxiliar administrativa por WhatsApp, una por una con el nombre, y ella las guarda en el computador de la academia. Al que no quede grabado en la Clase 1 (llegó tarde, se fue antes) o entre después como estudiante nuevo, se le graba en la primera clase a la que asista, ese mismo día: ningún estudiante queda sin grabación de entrada.</w:t>
       </w:r>
     </w:p>
     <w:p>

</xml_diff>